<commit_message>
Remove introductory sentence from advanced lab report for clarity and conciseness.
</commit_message>
<xml_diff>
--- a/iuh/môn/da-phuong-tien/lab5/LO2_HDH_CNM_HoTroDPT/l02-2/23630851_Lê Thành Long_lab5-2.docx
+++ b/iuh/môn/da-phuong-tien/lab5/LO2_HDH_CNM_HoTroDPT/l02-2/23630851_Lê Thành Long_lab5-2.docx
@@ -2067,17 +2067,6 @@
           <w:lang w:val="vi-VN"/>
         </w:rPr>
       </w:pPr>
-    </w:p>
-    <w:p>
-      <w:pPr>
-        <w:tabs>
-          <w:tab w:val="left" w:leader="dot" w:pos="9270"/>
-        </w:tabs>
-        <w:ind w:firstLine="450"/>
-      </w:pPr>
-      <w:r>
-        <w:t>Chắc chắn rồi. Dưới đây là phần giải đáp chi tiết và đầy đủ cho bài thực hành nâng cao, được trình bày dưới dạng một báo cáo thực nghiệm, giúp bạn phân tích sâu hơn các khái niệm đã học.</w:t>
-      </w:r>
     </w:p>
     <w:p>
       <w:pPr>

</xml_diff>